<commit_message>
Android: compile Kotlin in-process to fix 'Could not connect to Kotlin compile daemon'
Gradle now compiles Kotlin inside its own process (no separate Kotlin
daemon) with more memory (4 GB). The install guide explains the error and
the remaining fallbacks (gradlew --stop, English-only path, Gradle JDK
jbr-21, antivirus).

Co-Authored-By: Claude Opus 5.5 <noreply@anthropic.com>
Claude-Session: https://claude.ai/code/session_01LUEXdLPnpgGnWTyNRXft8r
</commit_message>
<xml_diff>
--- a/rayy-mysql/docs/دليل التثبيت - ري.docx
+++ b/rayy-mysql/docs/دليل التثبيت - ري.docx
@@ -6391,6 +6391,197 @@
         <w:t xml:space="preserve"> (أول مرة يحتاج إنترنت ووقتاً). إذا طلب تحديث Android Gradle Plugin أو Kotlin فوافقي.</w:t>
       </w:r>
     </w:p>
+    <w:tbl>
+      <w:tblPr>
+        <w:tblStyle w:val="TableGrid"/>
+        <w:bidiVisual/>
+        <w:tblW w:type="auto" w:w="0"/>
+        <w:tblLook w:firstColumn="1" w:firstRow="1" w:lastColumn="0" w:lastRow="0" w:noHBand="0" w:noVBand="1" w:val="04A0"/>
+      </w:tblPr>
+      <w:tblGrid>
+        <w:gridCol w:w="9866"/>
+      </w:tblGrid>
+      <w:tr>
+        <w:tc>
+          <w:tcPr>
+            <w:tcW w:type="dxa" w:w="9866"/>
+            <w:shd w:val="clear" w:fill="FFF1D6"/>
+          </w:tcPr>
+          <w:p>
+            <w:pPr>
+              <w:bidi/>
+              <w:spacing w:before="40" w:after="40"/>
+              <w:jc w:val="both"/>
+            </w:pPr>
+            <w:r>
+              <w:rPr>
+                <w:b/>
+                <w:bCs/>
+                <w:color w:val="8A5A00"/>
+                <w:sz w:val="24"/>
+                <w:szCs w:val="24"/>
+                <w:rtl/>
+              </w:rPr>
+              <w:t xml:space="preserve">⚠  </w:t>
+            </w:r>
+            <w:r>
+              <w:rPr>
+                <w:b/>
+                <w:bCs/>
+                <w:color w:val="8A5A00"/>
+                <w:sz w:val="23"/>
+                <w:szCs w:val="23"/>
+                <w:rtl/>
+              </w:rPr>
+              <w:t>إذا ظهر الخطأ Could not connect to Kotlin compile daemon:</w:t>
+            </w:r>
+            <w:r>
+              <w:rPr>
+                <w:b w:val="0"/>
+                <w:color w:val="8A5A00"/>
+                <w:sz w:val="23"/>
+                <w:szCs w:val="23"/>
+                <w:rtl/>
+              </w:rPr>
+              <w:t xml:space="preserve"> الإصلاح موجود في ملف gradle.properties (السطر kotlin.compiler.execution.strategy=in-process). اضغطي </w:t>
+            </w:r>
+            <w:r>
+              <w:rPr>
+                <w:b/>
+                <w:bCs/>
+                <w:color w:val="8A5A00"/>
+                <w:sz w:val="23"/>
+                <w:szCs w:val="23"/>
+                <w:rtl/>
+              </w:rPr>
+              <w:t>File ← Sync Project with Gradle Files</w:t>
+            </w:r>
+            <w:r>
+              <w:rPr>
+                <w:b w:val="0"/>
+                <w:color w:val="8A5A00"/>
+                <w:sz w:val="23"/>
+                <w:szCs w:val="23"/>
+                <w:rtl/>
+              </w:rPr>
+              <w:t xml:space="preserve"> ثم </w:t>
+            </w:r>
+            <w:r>
+              <w:rPr>
+                <w:b/>
+                <w:bCs/>
+                <w:color w:val="8A5A00"/>
+                <w:sz w:val="23"/>
+                <w:szCs w:val="23"/>
+                <w:rtl/>
+              </w:rPr>
+              <w:t>Build ← Clean Project</w:t>
+            </w:r>
+            <w:r>
+              <w:rPr>
+                <w:b w:val="0"/>
+                <w:color w:val="8A5A00"/>
+                <w:sz w:val="23"/>
+                <w:szCs w:val="23"/>
+                <w:rtl/>
+              </w:rPr>
+              <w:t xml:space="preserve"> ثم </w:t>
+            </w:r>
+            <w:r>
+              <w:rPr>
+                <w:b/>
+                <w:bCs/>
+                <w:color w:val="8A5A00"/>
+                <w:sz w:val="23"/>
+                <w:szCs w:val="23"/>
+                <w:rtl/>
+              </w:rPr>
+              <w:t>Build ← Rebuild Project</w:t>
+            </w:r>
+            <w:r>
+              <w:rPr>
+                <w:b w:val="0"/>
+                <w:color w:val="8A5A00"/>
+                <w:sz w:val="23"/>
+                <w:szCs w:val="23"/>
+                <w:rtl/>
+              </w:rPr>
+              <w:t xml:space="preserve">. وإذا استمر: (1) من تبويب </w:t>
+            </w:r>
+            <w:r>
+              <w:rPr>
+                <w:b/>
+                <w:bCs/>
+                <w:color w:val="8A5A00"/>
+                <w:sz w:val="23"/>
+                <w:szCs w:val="23"/>
+                <w:rtl/>
+              </w:rPr>
+              <w:t>Terminal</w:t>
+            </w:r>
+            <w:r>
+              <w:rPr>
+                <w:b w:val="0"/>
+                <w:color w:val="8A5A00"/>
+                <w:sz w:val="23"/>
+                <w:szCs w:val="23"/>
+                <w:rtl/>
+              </w:rPr>
+              <w:t xml:space="preserve"> أسفل Android Studio اكتبي gradlew --stop ثم أعيدي البناء، (2) انقلي المشروع إلى مسار بحروف إنجليزية فقط وبدون OneDrive مثل ‎C:\Rayy\android\Rayy‎، (3) من </w:t>
+            </w:r>
+            <w:r>
+              <w:rPr>
+                <w:b/>
+                <w:bCs/>
+                <w:color w:val="8A5A00"/>
+                <w:sz w:val="23"/>
+                <w:szCs w:val="23"/>
+                <w:rtl/>
+              </w:rPr>
+              <w:t>Settings ← Build Tools ← Gradle ← Gradle JDK</w:t>
+            </w:r>
+            <w:r>
+              <w:rPr>
+                <w:b w:val="0"/>
+                <w:color w:val="8A5A00"/>
+                <w:sz w:val="23"/>
+                <w:szCs w:val="23"/>
+                <w:rtl/>
+              </w:rPr>
+              <w:t xml:space="preserve"> اختاري </w:t>
+            </w:r>
+            <w:r>
+              <w:rPr>
+                <w:b/>
+                <w:bCs/>
+                <w:color w:val="8A5A00"/>
+                <w:sz w:val="23"/>
+                <w:szCs w:val="23"/>
+                <w:rtl/>
+              </w:rPr>
+              <w:t>jbr-21</w:t>
+            </w:r>
+            <w:r>
+              <w:rPr>
+                <w:b w:val="0"/>
+                <w:color w:val="8A5A00"/>
+                <w:sz w:val="23"/>
+                <w:szCs w:val="23"/>
+                <w:rtl/>
+              </w:rPr>
+              <w:t xml:space="preserve"> (JetBrains Runtime 21)، (4) أوقفي مكافح الفيروسات مؤقتاً أو استثني مجلد المشروع.</w:t>
+            </w:r>
+          </w:p>
+        </w:tc>
+      </w:tr>
+    </w:tbl>
+    <w:p>
+      <w:pPr>
+        <w:bidi/>
+        <w:spacing w:before="0" w:after="40"/>
+        <w:jc w:val="both"/>
+      </w:pPr>
+    </w:p>
     <w:p>
       <w:pPr>
         <w:bidi/>

</xml_diff>